<commit_message>
Added dates to each day of the week in calender view
</commit_message>
<xml_diff>
--- a/työnseuranta/Työaikaraportti – Jussi.docx
+++ b/työnseuranta/Työaikaraportti – Jussi.docx
@@ -350,19 +350,31 @@
           <w:tcPr>
             <w:tcW w:w="1980" w:type="dxa"/>
           </w:tcPr>
-          <w:p/>
-        </w:tc>
-        <w:tc>
-          <w:tcPr>
-            <w:tcW w:w="2551" w:type="dxa"/>
-          </w:tcPr>
-          <w:p/>
-        </w:tc>
-        <w:tc>
-          <w:tcPr>
-            <w:tcW w:w="5103" w:type="dxa"/>
-          </w:tcPr>
-          <w:p/>
+          <w:p>
+            <w:r>
+              <w:t>03.10</w:t>
+            </w:r>
+          </w:p>
+        </w:tc>
+        <w:tc>
+          <w:tcPr>
+            <w:tcW w:w="2551" w:type="dxa"/>
+          </w:tcPr>
+          <w:p>
+            <w:r>
+              <w:t>2h</w:t>
+            </w:r>
+          </w:p>
+        </w:tc>
+        <w:tc>
+          <w:tcPr>
+            <w:tcW w:w="5103" w:type="dxa"/>
+          </w:tcPr>
+          <w:p>
+            <w:r>
+              <w:t>Palaveerausta koululla ja branch mergettämisen korjausta</w:t>
+            </w:r>
+          </w:p>
         </w:tc>
       </w:tr>
       <w:tr>

</xml_diff>

<commit_message>
fixed broken functionalites from previous merge
</commit_message>
<xml_diff>
--- a/työnseuranta/Työaikaraportti – Jussi.docx
+++ b/työnseuranta/Työaikaraportti – Jussi.docx
@@ -382,79 +382,139 @@
           <w:tcPr>
             <w:tcW w:w="1980" w:type="dxa"/>
           </w:tcPr>
-          <w:p/>
-        </w:tc>
-        <w:tc>
-          <w:tcPr>
-            <w:tcW w:w="2551" w:type="dxa"/>
-          </w:tcPr>
-          <w:p/>
-        </w:tc>
-        <w:tc>
-          <w:tcPr>
-            <w:tcW w:w="5103" w:type="dxa"/>
-          </w:tcPr>
-          <w:p/>
-        </w:tc>
-      </w:tr>
-      <w:tr>
-        <w:tc>
-          <w:tcPr>
-            <w:tcW w:w="1980" w:type="dxa"/>
-          </w:tcPr>
-          <w:p/>
-        </w:tc>
-        <w:tc>
-          <w:tcPr>
-            <w:tcW w:w="2551" w:type="dxa"/>
-          </w:tcPr>
-          <w:p/>
-        </w:tc>
-        <w:tc>
-          <w:tcPr>
-            <w:tcW w:w="5103" w:type="dxa"/>
-          </w:tcPr>
-          <w:p/>
-        </w:tc>
-      </w:tr>
-      <w:tr>
-        <w:tc>
-          <w:tcPr>
-            <w:tcW w:w="1980" w:type="dxa"/>
-          </w:tcPr>
-          <w:p/>
-        </w:tc>
-        <w:tc>
-          <w:tcPr>
-            <w:tcW w:w="2551" w:type="dxa"/>
-          </w:tcPr>
-          <w:p/>
-        </w:tc>
-        <w:tc>
-          <w:tcPr>
-            <w:tcW w:w="5103" w:type="dxa"/>
-          </w:tcPr>
-          <w:p/>
-        </w:tc>
-      </w:tr>
-      <w:tr>
-        <w:tc>
-          <w:tcPr>
-            <w:tcW w:w="1980" w:type="dxa"/>
-          </w:tcPr>
-          <w:p/>
-        </w:tc>
-        <w:tc>
-          <w:tcPr>
-            <w:tcW w:w="2551" w:type="dxa"/>
-          </w:tcPr>
-          <w:p/>
-        </w:tc>
-        <w:tc>
-          <w:tcPr>
-            <w:tcW w:w="5103" w:type="dxa"/>
-          </w:tcPr>
-          <w:p/>
+          <w:p>
+            <w:r>
+              <w:t>06.10</w:t>
+            </w:r>
+          </w:p>
+        </w:tc>
+        <w:tc>
+          <w:tcPr>
+            <w:tcW w:w="2551" w:type="dxa"/>
+          </w:tcPr>
+          <w:p>
+            <w:r>
+              <w:t>3h</w:t>
+            </w:r>
+          </w:p>
+        </w:tc>
+        <w:tc>
+          <w:tcPr>
+            <w:tcW w:w="5103" w:type="dxa"/>
+          </w:tcPr>
+          <w:p>
+            <w:r>
+              <w:t>Kalenterin täyttön tekemist</w:t>
+            </w:r>
+            <w:r>
+              <w:t>ä</w:t>
+            </w:r>
+          </w:p>
+        </w:tc>
+      </w:tr>
+      <w:tr>
+        <w:tc>
+          <w:tcPr>
+            <w:tcW w:w="1980" w:type="dxa"/>
+          </w:tcPr>
+          <w:p>
+            <w:r>
+              <w:t>09.10</w:t>
+            </w:r>
+          </w:p>
+        </w:tc>
+        <w:tc>
+          <w:tcPr>
+            <w:tcW w:w="2551" w:type="dxa"/>
+          </w:tcPr>
+          <w:p>
+            <w:r>
+              <w:t>3h</w:t>
+            </w:r>
+          </w:p>
+        </w:tc>
+        <w:tc>
+          <w:tcPr>
+            <w:tcW w:w="5103" w:type="dxa"/>
+          </w:tcPr>
+          <w:p>
+            <w:r>
+              <w:t>Kal</w:t>
+            </w:r>
+            <w:r>
+              <w:t>e</w:t>
+            </w:r>
+            <w:r>
+              <w:t>nterin täytön</w:t>
+            </w:r>
+            <w:r>
+              <w:t xml:space="preserve"> ja navigoinnin korjausta</w:t>
+            </w:r>
+          </w:p>
+        </w:tc>
+      </w:tr>
+      <w:tr>
+        <w:tc>
+          <w:tcPr>
+            <w:tcW w:w="1980" w:type="dxa"/>
+          </w:tcPr>
+          <w:p>
+            <w:r>
+              <w:t>12.10</w:t>
+            </w:r>
+          </w:p>
+        </w:tc>
+        <w:tc>
+          <w:tcPr>
+            <w:tcW w:w="2551" w:type="dxa"/>
+          </w:tcPr>
+          <w:p>
+            <w:r>
+              <w:t>2h</w:t>
+            </w:r>
+          </w:p>
+        </w:tc>
+        <w:tc>
+          <w:tcPr>
+            <w:tcW w:w="5103" w:type="dxa"/>
+          </w:tcPr>
+          <w:p>
+            <w:r>
+              <w:t>Kalenteri päivitystä, compare ikkuna automisointia ja username valinta</w:t>
+            </w:r>
+          </w:p>
+        </w:tc>
+      </w:tr>
+      <w:tr>
+        <w:tc>
+          <w:tcPr>
+            <w:tcW w:w="1980" w:type="dxa"/>
+          </w:tcPr>
+          <w:p>
+            <w:r>
+              <w:t>15.10</w:t>
+            </w:r>
+          </w:p>
+        </w:tc>
+        <w:tc>
+          <w:tcPr>
+            <w:tcW w:w="2551" w:type="dxa"/>
+          </w:tcPr>
+          <w:p>
+            <w:r>
+              <w:t>5h</w:t>
+            </w:r>
+          </w:p>
+        </w:tc>
+        <w:tc>
+          <w:tcPr>
+            <w:tcW w:w="5103" w:type="dxa"/>
+          </w:tcPr>
+          <w:p>
+            <w:r>
+              <w:t xml:space="preserve">viimeistelyä ja gitin korjausta </w:t>
+            </w:r>
+          </w:p>
         </w:tc>
       </w:tr>
       <w:tr>
@@ -875,6 +935,7 @@
                 <w:b/>
                 <w:bCs/>
               </w:rPr>
+              <w:lastRenderedPageBreak/>
               <w:t>Yhteensä</w:t>
             </w:r>
           </w:p>

</xml_diff>